<commit_message>
docs: regenerate 10-开发上手指南.docx after the file was released
The previous regeneration silently skipped this file because Word held a write
lock. Verified now: the docx contains 139 个主代码 / 19 个单元测试文件 /
template-v2 / 3.1 十个阶段之外, and the old '89 → 90' string is gone.
</commit_message>
<xml_diff>
--- a/docs/word/10-开发上手指南.docx
+++ b/docs/word/10-开发上手指南.docx
@@ -447,36 +447,534 @@
       </w:pPr>
       <w:r>
         <w:rPr/>
-        <w:t>仓库里的后端实现已经完整（</w:t>
-      </w:r>
-      <w:r>
-        <w:rPr/>
-        <w:t xml:space="preserve">89 → 90 </w:t>
-      </w:r>
-      <w:r>
-        <w:rPr/>
-        <w:t xml:space="preserve">个 </w:t>
-      </w:r>
-      <w:r>
-        <w:rPr/>
+        <w:t>仓库里的后端实现已经完整：</w:t>
+      </w:r>
+      <w:r>
+        <w:rPr>
+          <w:b/>
+        </w:rPr>
+        <w:t xml:space="preserve">139 </w:t>
+      </w:r>
+      <w:r>
+        <w:rPr>
+          <w:b/>
+        </w:rPr>
+        <w:t xml:space="preserve">个主代码 </w:t>
+      </w:r>
+      <w:r>
+        <w:rPr>
+          <w:b/>
+        </w:rPr>
         <w:t xml:space="preserve">Java </w:t>
       </w:r>
       <w:r>
-        <w:rPr/>
-        <w:t xml:space="preserve">文件，含完整单元测试），并打了 </w:t>
-      </w:r>
-      <w:r>
-        <w:rPr/>
-        <w:t>tag `template-v1`</w:t>
-      </w:r>
-      <w:r>
-        <w:rPr/>
-        <w:t xml:space="preserve">。 </w:t>
-      </w:r>
-      <w:r>
         <w:rPr>
           <w:b/>
         </w:rPr>
+        <w:t xml:space="preserve">文件 </w:t>
+      </w:r>
+      <w:r>
+        <w:rPr>
+          <w:b/>
+        </w:rPr>
+        <w:t xml:space="preserve">+ 19 </w:t>
+      </w:r>
+      <w:r>
+        <w:rPr>
+          <w:b/>
+        </w:rPr>
+        <w:t>个单元测试文件</w:t>
+      </w:r>
+      <w:r>
+        <w:rPr/>
+        <w:t xml:space="preserve">（共 </w:t>
+      </w:r>
+      <w:r>
+        <w:rPr/>
+        <w:t xml:space="preserve">158 </w:t>
+      </w:r>
+      <w:r>
+        <w:rPr/>
+        <w:t xml:space="preserve">个），另有 </w:t>
+      </w:r>
+      <w:r>
+        <w:rPr>
+          <w:b/>
+        </w:rPr>
+        <w:t xml:space="preserve">9 </w:t>
+      </w:r>
+      <w:r>
+        <w:rPr>
+          <w:b/>
+        </w:rPr>
+        <w:t>个增量迁移脚本</w:t>
+      </w:r>
+      <w:r>
+        <w:rPr/>
+        <w:t>（</w:t>
+      </w:r>
+      <w:r>
+        <w:rPr/>
+        <w:t>`V2`~`V10`</w:t>
+      </w:r>
+      <w:r>
+        <w:rPr/>
+        <w:t>；</w:t>
+      </w:r>
+      <w:r>
+        <w:rPr/>
+        <w:t xml:space="preserve">`V1` </w:t>
+      </w:r>
+      <w:r>
+        <w:rPr/>
+        <w:t xml:space="preserve">即基线 </w:t>
+      </w:r>
+      <w:r>
+        <w:rPr/>
+        <w:t>`schema.sql`</w:t>
+      </w:r>
+      <w:r>
+        <w:rPr/>
+        <w:t>）。</w:t>
+      </w:r>
+    </w:p>
+    <w:p>
+      <w:pPr>
+        <w:pStyle w:val="BodyText"/>
+        <w:bidi w:val="0"/>
+        <w:jc w:val="left"/>
+        <w:rPr/>
+      </w:pPr>
+      <w:r>
+        <w:rPr/>
+        <w:t>两个标签的分工，别混用：</w:t>
+      </w:r>
+    </w:p>
+    <w:tbl>
+      <w:tblPr>
+        <w:tblW w:w="9951" w:type="dxa"/>
+        <w:jc w:val="left"/>
+        <w:tblInd w:w="28" w:type="dxa"/>
+        <w:tblLayout w:type="fixed"/>
+        <w:tblCellMar>
+          <w:top w:w="28" w:type="dxa"/>
+          <w:left w:w="28" w:type="dxa"/>
+          <w:bottom w:w="28" w:type="dxa"/>
+          <w:right w:w="28" w:type="dxa"/>
+        </w:tblCellMar>
+      </w:tblPr>
+      <w:tblGrid>
+        <w:gridCol w:w="1428"/>
+        <w:gridCol w:w="1126"/>
+        <w:gridCol w:w="5002"/>
+        <w:gridCol w:w="2395"/>
+      </w:tblGrid>
+      <w:tr>
+        <w:trPr/>
+        <w:tc>
+          <w:tcPr>
+            <w:tcW w:w="1428" w:type="dxa"/>
+            <w:tcBorders/>
+            <w:vAlign w:val="center"/>
+          </w:tcPr>
+          <w:p>
+            <w:pPr>
+              <w:pStyle w:val="Style19"/>
+              <w:suppressLineNumbers/>
+              <w:shd w:fill="EEF1F4" w:val="clear"/>
+              <w:bidi w:val="0"/>
+              <w:spacing w:before="0" w:after="283"/>
+              <w:jc w:val="left"/>
+              <w:rPr/>
+            </w:pPr>
+            <w:r>
+              <w:rPr/>
+              <w:t>标签</w:t>
+            </w:r>
+          </w:p>
+        </w:tc>
+        <w:tc>
+          <w:tcPr>
+            <w:tcW w:w="1126" w:type="dxa"/>
+            <w:tcBorders/>
+            <w:vAlign w:val="center"/>
+          </w:tcPr>
+          <w:p>
+            <w:pPr>
+              <w:pStyle w:val="Style19"/>
+              <w:suppressLineNumbers/>
+              <w:shd w:fill="EEF1F4" w:val="clear"/>
+              <w:bidi w:val="0"/>
+              <w:spacing w:before="0" w:after="283"/>
+              <w:jc w:val="left"/>
+              <w:rPr/>
+            </w:pPr>
+            <w:r>
+              <w:rPr/>
+              <w:t>指向</w:t>
+            </w:r>
+          </w:p>
+        </w:tc>
+        <w:tc>
+          <w:tcPr>
+            <w:tcW w:w="5002" w:type="dxa"/>
+            <w:tcBorders/>
+            <w:vAlign w:val="center"/>
+          </w:tcPr>
+          <w:p>
+            <w:pPr>
+              <w:pStyle w:val="Style19"/>
+              <w:suppressLineNumbers/>
+              <w:shd w:fill="EEF1F4" w:val="clear"/>
+              <w:bidi w:val="0"/>
+              <w:spacing w:before="0" w:after="283"/>
+              <w:jc w:val="left"/>
+              <w:rPr/>
+            </w:pPr>
+            <w:r>
+              <w:rPr/>
+              <w:t>内容</w:t>
+            </w:r>
+          </w:p>
+        </w:tc>
+        <w:tc>
+          <w:tcPr>
+            <w:tcW w:w="2395" w:type="dxa"/>
+            <w:tcBorders/>
+            <w:vAlign w:val="center"/>
+          </w:tcPr>
+          <w:p>
+            <w:pPr>
+              <w:pStyle w:val="Style19"/>
+              <w:suppressLineNumbers/>
+              <w:shd w:fill="EEF1F4" w:val="clear"/>
+              <w:bidi w:val="0"/>
+              <w:spacing w:before="0" w:after="283"/>
+              <w:jc w:val="left"/>
+              <w:rPr/>
+            </w:pPr>
+            <w:r>
+              <w:rPr/>
+              <w:t>用途</w:t>
+            </w:r>
+          </w:p>
+        </w:tc>
+      </w:tr>
+      <w:tr>
+        <w:trPr/>
+        <w:tc>
+          <w:tcPr>
+            <w:tcW w:w="1428" w:type="dxa"/>
+            <w:tcBorders/>
+            <w:vAlign w:val="center"/>
+          </w:tcPr>
+          <w:p>
+            <w:pPr>
+              <w:pStyle w:val="Style14"/>
+              <w:bidi w:val="0"/>
+              <w:spacing w:before="0" w:after="283"/>
+              <w:jc w:val="left"/>
+              <w:rPr/>
+            </w:pPr>
+            <w:r>
+              <w:rPr/>
+              <w:t>`skeleton-v1`</w:t>
+            </w:r>
+          </w:p>
+        </w:tc>
+        <w:tc>
+          <w:tcPr>
+            <w:tcW w:w="1126" w:type="dxa"/>
+            <w:tcBorders/>
+            <w:vAlign w:val="center"/>
+          </w:tcPr>
+          <w:p>
+            <w:pPr>
+              <w:pStyle w:val="Style14"/>
+              <w:bidi w:val="0"/>
+              <w:spacing w:before="0" w:after="283"/>
+              <w:jc w:val="left"/>
+              <w:rPr/>
+            </w:pPr>
+            <w:r>
+              <w:rPr/>
+              <w:t>早期骨架</w:t>
+            </w:r>
+          </w:p>
+        </w:tc>
+        <w:tc>
+          <w:tcPr>
+            <w:tcW w:w="5002" w:type="dxa"/>
+            <w:tcBorders/>
+            <w:vAlign w:val="center"/>
+          </w:tcPr>
+          <w:p>
+            <w:pPr>
+              <w:pStyle w:val="Style14"/>
+              <w:bidi w:val="0"/>
+              <w:spacing w:before="0" w:after="283"/>
+              <w:jc w:val="left"/>
+              <w:rPr/>
+            </w:pPr>
+            <w:r>
+              <w:rPr/>
+              <w:t xml:space="preserve">89 </w:t>
+            </w:r>
+            <w:r>
+              <w:rPr/>
+              <w:t xml:space="preserve">个 </w:t>
+            </w:r>
+            <w:r>
+              <w:rPr/>
+              <w:t xml:space="preserve">Java </w:t>
+            </w:r>
+            <w:r>
+              <w:rPr/>
+              <w:t>文件</w:t>
+            </w:r>
+          </w:p>
+        </w:tc>
+        <w:tc>
+          <w:tcPr>
+            <w:tcW w:w="2395" w:type="dxa"/>
+            <w:tcBorders/>
+            <w:vAlign w:val="center"/>
+          </w:tcPr>
+          <w:p>
+            <w:pPr>
+              <w:pStyle w:val="Style14"/>
+              <w:bidi w:val="0"/>
+              <w:spacing w:before="0" w:after="283"/>
+              <w:jc w:val="left"/>
+              <w:rPr/>
+            </w:pPr>
+            <w:r>
+              <w:rPr/>
+              <w:t>只作对照，不建议直接抄</w:t>
+            </w:r>
+          </w:p>
+        </w:tc>
+      </w:tr>
+      <w:tr>
+        <w:trPr/>
+        <w:tc>
+          <w:tcPr>
+            <w:tcW w:w="1428" w:type="dxa"/>
+            <w:tcBorders/>
+            <w:vAlign w:val="center"/>
+          </w:tcPr>
+          <w:p>
+            <w:pPr>
+              <w:pStyle w:val="Style14"/>
+              <w:bidi w:val="0"/>
+              <w:spacing w:before="0" w:after="283"/>
+              <w:jc w:val="left"/>
+              <w:rPr/>
+            </w:pPr>
+            <w:r>
+              <w:rPr/>
+              <w:t>`template-v1`</w:t>
+            </w:r>
+          </w:p>
+        </w:tc>
+        <w:tc>
+          <w:tcPr>
+            <w:tcW w:w="1126" w:type="dxa"/>
+            <w:tcBorders/>
+            <w:vAlign w:val="center"/>
+          </w:tcPr>
+          <w:p>
+            <w:pPr>
+              <w:pStyle w:val="Style14"/>
+              <w:bidi w:val="0"/>
+              <w:spacing w:before="0" w:after="283"/>
+              <w:jc w:val="left"/>
+              <w:rPr/>
+            </w:pPr>
+            <w:r>
+              <w:rPr/>
+              <w:t>基线完整版</w:t>
+            </w:r>
+          </w:p>
+        </w:tc>
+        <w:tc>
+          <w:tcPr>
+            <w:tcW w:w="5002" w:type="dxa"/>
+            <w:tcBorders/>
+            <w:vAlign w:val="center"/>
+          </w:tcPr>
+          <w:p>
+            <w:pPr>
+              <w:pStyle w:val="Style14"/>
+              <w:bidi w:val="0"/>
+              <w:spacing w:before="0" w:after="283"/>
+              <w:jc w:val="left"/>
+              <w:rPr/>
+            </w:pPr>
+            <w:r>
+              <w:rPr/>
+              <w:t xml:space="preserve">约 </w:t>
+            </w:r>
+            <w:r>
+              <w:rPr/>
+              <w:t xml:space="preserve">90 </w:t>
+            </w:r>
+            <w:r>
+              <w:rPr/>
+              <w:t xml:space="preserve">个文件 </w:t>
+            </w:r>
+            <w:r>
+              <w:rPr/>
+              <w:t xml:space="preserve">/ 79 </w:t>
+            </w:r>
+            <w:r>
+              <w:rPr/>
+              <w:t xml:space="preserve">个测试，即第三章 </w:t>
+            </w:r>
+            <w:r>
+              <w:rPr/>
+              <w:t xml:space="preserve">10 </w:t>
+            </w:r>
+            <w:r>
+              <w:rPr/>
+              <w:t>个阶段的产物</w:t>
+            </w:r>
+          </w:p>
+        </w:tc>
+        <w:tc>
+          <w:tcPr>
+            <w:tcW w:w="2395" w:type="dxa"/>
+            <w:tcBorders/>
+            <w:vAlign w:val="center"/>
+          </w:tcPr>
+          <w:p>
+            <w:pPr>
+              <w:pStyle w:val="Style14"/>
+              <w:bidi w:val="0"/>
+              <w:spacing w:before="0" w:after="283"/>
+              <w:jc w:val="left"/>
+              <w:rPr/>
+            </w:pPr>
+            <w:r>
+              <w:rPr/>
+              <w:t xml:space="preserve">学完 </w:t>
+            </w:r>
+            <w:r>
+              <w:rPr/>
+              <w:t xml:space="preserve">10 </w:t>
+            </w:r>
+            <w:r>
+              <w:rPr/>
+              <w:t>个阶段后对答案</w:t>
+            </w:r>
+          </w:p>
+        </w:tc>
+      </w:tr>
+      <w:tr>
+        <w:trPr/>
+        <w:tc>
+          <w:tcPr>
+            <w:tcW w:w="1428" w:type="dxa"/>
+            <w:tcBorders/>
+            <w:vAlign w:val="center"/>
+          </w:tcPr>
+          <w:p>
+            <w:pPr>
+              <w:pStyle w:val="Style14"/>
+              <w:bidi w:val="0"/>
+              <w:spacing w:before="0" w:after="283"/>
+              <w:jc w:val="left"/>
+              <w:rPr/>
+            </w:pPr>
+            <w:r>
+              <w:rPr/>
+              <w:t>`template-v2`</w:t>
+            </w:r>
+          </w:p>
+        </w:tc>
+        <w:tc>
+          <w:tcPr>
+            <w:tcW w:w="1126" w:type="dxa"/>
+            <w:tcBorders/>
+            <w:vAlign w:val="center"/>
+          </w:tcPr>
+          <w:p>
+            <w:pPr>
+              <w:pStyle w:val="Style14"/>
+              <w:bidi w:val="0"/>
+              <w:spacing w:before="0" w:after="283"/>
+              <w:jc w:val="left"/>
+              <w:rPr/>
+            </w:pPr>
+            <w:r>
+              <w:rPr/>
+              <w:t>当前最新</w:t>
+            </w:r>
+          </w:p>
+        </w:tc>
+        <w:tc>
+          <w:tcPr>
+            <w:tcW w:w="5002" w:type="dxa"/>
+            <w:tcBorders/>
+            <w:vAlign w:val="center"/>
+          </w:tcPr>
+          <w:p>
+            <w:pPr>
+              <w:pStyle w:val="Style14"/>
+              <w:bidi w:val="0"/>
+              <w:spacing w:before="0" w:after="283"/>
+              <w:jc w:val="left"/>
+              <w:rPr/>
+            </w:pPr>
+            <w:r>
+              <w:rPr/>
+              <w:t xml:space="preserve">139 + 19 </w:t>
+            </w:r>
+            <w:r>
+              <w:rPr/>
+              <w:t>个文件，含交易闭环与推荐改进</w:t>
+            </w:r>
+          </w:p>
+        </w:tc>
+        <w:tc>
+          <w:tcPr>
+            <w:tcW w:w="2395" w:type="dxa"/>
+            <w:tcBorders/>
+            <w:vAlign w:val="center"/>
+          </w:tcPr>
+          <w:p>
+            <w:pPr>
+              <w:pStyle w:val="Style14"/>
+              <w:bidi w:val="0"/>
+              <w:spacing w:before="0" w:after="283"/>
+              <w:jc w:val="left"/>
+              <w:rPr>
+                <w:b/>
+              </w:rPr>
+            </w:pPr>
+            <w:r>
+              <w:rPr>
+                <w:b/>
+              </w:rPr>
+              <w:t>想直接看最终形态就用它</w:t>
+            </w:r>
+          </w:p>
+        </w:tc>
+      </w:tr>
+    </w:tbl>
+    <w:p>
+      <w:pPr>
+        <w:pStyle w:val="BodyText"/>
+        <w:bidi w:val="0"/>
+        <w:jc w:val="left"/>
+        <w:rPr>
+          <w:b/>
+        </w:rPr>
+      </w:pPr>
+      <w:r>
+        <w:rPr>
+          <w:b/>
+        </w:rPr>
         <w:t>推荐的学习方式：把它当答案，自己从零再写一遍。</w:t>
       </w:r>
     </w:p>
@@ -678,7 +1176,7 @@
         <w:rPr>
           <w:rStyle w:val="Style10"/>
         </w:rPr>
-        <w:t>git show template-v1:recommend-server/src/main/java/com/deng/recommend/recommend/UserCFStrategy.java</w:t>
+        <w:t>git show template-v2:recommend-server/src/main/java/com/deng/recommend/recommend/UserCFStrategy.java</w:t>
       </w:r>
     </w:p>
     <w:p>
@@ -6847,9 +7345,9 @@
       </w:tblPr>
       <w:tblGrid>
         <w:gridCol w:w="529"/>
-        <w:gridCol w:w="6702"/>
-        <w:gridCol w:w="2890"/>
-        <w:gridCol w:w="1218"/>
+        <w:gridCol w:w="6454"/>
+        <w:gridCol w:w="3155"/>
+        <w:gridCol w:w="1201"/>
       </w:tblGrid>
       <w:tr>
         <w:trPr/>
@@ -6877,7 +7375,7 @@
         </w:tc>
         <w:tc>
           <w:tcPr>
-            <w:tcW w:w="6702" w:type="dxa"/>
+            <w:tcW w:w="6454" w:type="dxa"/>
             <w:tcBorders/>
             <w:vAlign w:val="center"/>
           </w:tcPr>
@@ -6899,7 +7397,7 @@
         </w:tc>
         <w:tc>
           <w:tcPr>
-            <w:tcW w:w="2890" w:type="dxa"/>
+            <w:tcW w:w="3155" w:type="dxa"/>
             <w:tcBorders/>
             <w:vAlign w:val="center"/>
           </w:tcPr>
@@ -6921,7 +7419,7 @@
         </w:tc>
         <w:tc>
           <w:tcPr>
-            <w:tcW w:w="1218" w:type="dxa"/>
+            <w:tcW w:w="1201" w:type="dxa"/>
             <w:tcBorders/>
             <w:vAlign w:val="center"/>
           </w:tcPr>
@@ -6970,7 +7468,7 @@
         </w:tc>
         <w:tc>
           <w:tcPr>
-            <w:tcW w:w="6702" w:type="dxa"/>
+            <w:tcW w:w="6454" w:type="dxa"/>
             <w:tcBorders/>
             <w:vAlign w:val="center"/>
           </w:tcPr>
@@ -7006,31 +7504,51 @@
         </w:tc>
         <w:tc>
           <w:tcPr>
-            <w:tcW w:w="2890" w:type="dxa"/>
-            <w:tcBorders/>
-            <w:vAlign w:val="center"/>
-          </w:tcPr>
-          <w:p>
-            <w:pPr>
-              <w:pStyle w:val="Style14"/>
-              <w:bidi w:val="0"/>
-              <w:spacing w:before="0" w:after="283"/>
-              <w:jc w:val="left"/>
-              <w:rPr/>
-            </w:pPr>
+            <w:tcW w:w="3155" w:type="dxa"/>
+            <w:tcBorders/>
+            <w:vAlign w:val="center"/>
+          </w:tcPr>
+          <w:p>
+            <w:pPr>
+              <w:pStyle w:val="Style14"/>
+              <w:bidi w:val="0"/>
+              <w:spacing w:before="0" w:after="283"/>
+              <w:jc w:val="left"/>
+              <w:rPr/>
+            </w:pPr>
+            <w:r>
+              <w:rPr/>
+              <w:t xml:space="preserve">基线 </w:t>
+            </w:r>
             <w:r>
               <w:rPr/>
               <w:t xml:space="preserve">8 </w:t>
             </w:r>
             <w:r>
               <w:rPr/>
-              <w:t>张表建好</w:t>
-            </w:r>
-          </w:p>
-        </w:tc>
-        <w:tc>
-          <w:tcPr>
-            <w:tcW w:w="1218" w:type="dxa"/>
+              <w:t xml:space="preserve">张表建好（完整版共 </w:t>
+            </w:r>
+            <w:r>
+              <w:rPr/>
+              <w:t xml:space="preserve">13 </w:t>
+            </w:r>
+            <w:r>
+              <w:rPr/>
+              <w:t xml:space="preserve">张，其余见 </w:t>
+            </w:r>
+            <w:r>
+              <w:rPr/>
+              <w:t>3.1</w:t>
+            </w:r>
+            <w:r>
+              <w:rPr/>
+              <w:t>）</w:t>
+            </w:r>
+          </w:p>
+        </w:tc>
+        <w:tc>
+          <w:tcPr>
+            <w:tcW w:w="1201" w:type="dxa"/>
             <w:tcBorders/>
             <w:vAlign w:val="center"/>
           </w:tcPr>
@@ -7073,7 +7591,7 @@
         </w:tc>
         <w:tc>
           <w:tcPr>
-            <w:tcW w:w="6702" w:type="dxa"/>
+            <w:tcW w:w="6454" w:type="dxa"/>
             <w:tcBorders/>
             <w:vAlign w:val="center"/>
           </w:tcPr>
@@ -7117,7 +7635,7 @@
         </w:tc>
         <w:tc>
           <w:tcPr>
-            <w:tcW w:w="2890" w:type="dxa"/>
+            <w:tcW w:w="3155" w:type="dxa"/>
             <w:tcBorders/>
             <w:vAlign w:val="center"/>
           </w:tcPr>
@@ -7141,7 +7659,7 @@
         </w:tc>
         <w:tc>
           <w:tcPr>
-            <w:tcW w:w="1218" w:type="dxa"/>
+            <w:tcW w:w="1201" w:type="dxa"/>
             <w:tcBorders/>
             <w:vAlign w:val="center"/>
           </w:tcPr>
@@ -7184,7 +7702,7 @@
         </w:tc>
         <w:tc>
           <w:tcPr>
-            <w:tcW w:w="6702" w:type="dxa"/>
+            <w:tcW w:w="6454" w:type="dxa"/>
             <w:tcBorders/>
             <w:vAlign w:val="center"/>
           </w:tcPr>
@@ -7232,7 +7750,7 @@
         </w:tc>
         <w:tc>
           <w:tcPr>
-            <w:tcW w:w="2890" w:type="dxa"/>
+            <w:tcW w:w="3155" w:type="dxa"/>
             <w:tcBorders/>
             <w:vAlign w:val="center"/>
           </w:tcPr>
@@ -7260,7 +7778,7 @@
         </w:tc>
         <w:tc>
           <w:tcPr>
-            <w:tcW w:w="1218" w:type="dxa"/>
+            <w:tcW w:w="1201" w:type="dxa"/>
             <w:tcBorders/>
             <w:vAlign w:val="center"/>
           </w:tcPr>
@@ -7303,7 +7821,7 @@
         </w:tc>
         <w:tc>
           <w:tcPr>
-            <w:tcW w:w="6702" w:type="dxa"/>
+            <w:tcW w:w="6454" w:type="dxa"/>
             <w:tcBorders/>
             <w:vAlign w:val="center"/>
           </w:tcPr>
@@ -7335,7 +7853,7 @@
         </w:tc>
         <w:tc>
           <w:tcPr>
-            <w:tcW w:w="2890" w:type="dxa"/>
+            <w:tcW w:w="3155" w:type="dxa"/>
             <w:tcBorders/>
             <w:vAlign w:val="center"/>
           </w:tcPr>
@@ -7359,7 +7877,7 @@
         </w:tc>
         <w:tc>
           <w:tcPr>
-            <w:tcW w:w="1218" w:type="dxa"/>
+            <w:tcW w:w="1201" w:type="dxa"/>
             <w:tcBorders/>
             <w:vAlign w:val="center"/>
           </w:tcPr>
@@ -7402,7 +7920,7 @@
         </w:tc>
         <w:tc>
           <w:tcPr>
-            <w:tcW w:w="6702" w:type="dxa"/>
+            <w:tcW w:w="6454" w:type="dxa"/>
             <w:tcBorders/>
             <w:vAlign w:val="center"/>
           </w:tcPr>
@@ -7452,7 +7970,7 @@
         </w:tc>
         <w:tc>
           <w:tcPr>
-            <w:tcW w:w="2890" w:type="dxa"/>
+            <w:tcW w:w="3155" w:type="dxa"/>
             <w:tcBorders/>
             <w:vAlign w:val="center"/>
           </w:tcPr>
@@ -7472,7 +7990,7 @@
         </w:tc>
         <w:tc>
           <w:tcPr>
-            <w:tcW w:w="1218" w:type="dxa"/>
+            <w:tcW w:w="1201" w:type="dxa"/>
             <w:tcBorders/>
             <w:vAlign w:val="center"/>
           </w:tcPr>
@@ -7515,7 +8033,7 @@
         </w:tc>
         <w:tc>
           <w:tcPr>
-            <w:tcW w:w="6702" w:type="dxa"/>
+            <w:tcW w:w="6454" w:type="dxa"/>
             <w:tcBorders/>
             <w:vAlign w:val="center"/>
           </w:tcPr>
@@ -7535,7 +8053,7 @@
         </w:tc>
         <w:tc>
           <w:tcPr>
-            <w:tcW w:w="2890" w:type="dxa"/>
+            <w:tcW w:w="3155" w:type="dxa"/>
             <w:tcBorders/>
             <w:vAlign w:val="center"/>
           </w:tcPr>
@@ -7559,7 +8077,7 @@
         </w:tc>
         <w:tc>
           <w:tcPr>
-            <w:tcW w:w="1218" w:type="dxa"/>
+            <w:tcW w:w="1201" w:type="dxa"/>
             <w:tcBorders/>
             <w:vAlign w:val="center"/>
           </w:tcPr>
@@ -7602,7 +8120,7 @@
         </w:tc>
         <w:tc>
           <w:tcPr>
-            <w:tcW w:w="6702" w:type="dxa"/>
+            <w:tcW w:w="6454" w:type="dxa"/>
             <w:tcBorders/>
             <w:vAlign w:val="center"/>
           </w:tcPr>
@@ -7634,7 +8152,7 @@
         </w:tc>
         <w:tc>
           <w:tcPr>
-            <w:tcW w:w="2890" w:type="dxa"/>
+            <w:tcW w:w="3155" w:type="dxa"/>
             <w:tcBorders/>
             <w:vAlign w:val="center"/>
           </w:tcPr>
@@ -7654,7 +8172,7 @@
         </w:tc>
         <w:tc>
           <w:tcPr>
-            <w:tcW w:w="1218" w:type="dxa"/>
+            <w:tcW w:w="1201" w:type="dxa"/>
             <w:tcBorders/>
             <w:vAlign w:val="center"/>
           </w:tcPr>
@@ -7697,7 +8215,7 @@
         </w:tc>
         <w:tc>
           <w:tcPr>
-            <w:tcW w:w="6702" w:type="dxa"/>
+            <w:tcW w:w="6454" w:type="dxa"/>
             <w:tcBorders/>
             <w:vAlign w:val="center"/>
           </w:tcPr>
@@ -7737,7 +8255,7 @@
         </w:tc>
         <w:tc>
           <w:tcPr>
-            <w:tcW w:w="2890" w:type="dxa"/>
+            <w:tcW w:w="3155" w:type="dxa"/>
             <w:tcBorders/>
             <w:vAlign w:val="center"/>
           </w:tcPr>
@@ -7765,7 +8283,7 @@
         </w:tc>
         <w:tc>
           <w:tcPr>
-            <w:tcW w:w="1218" w:type="dxa"/>
+            <w:tcW w:w="1201" w:type="dxa"/>
             <w:tcBorders/>
             <w:vAlign w:val="center"/>
           </w:tcPr>
@@ -7808,7 +8326,7 @@
         </w:tc>
         <w:tc>
           <w:tcPr>
-            <w:tcW w:w="6702" w:type="dxa"/>
+            <w:tcW w:w="6454" w:type="dxa"/>
             <w:tcBorders/>
             <w:vAlign w:val="center"/>
           </w:tcPr>
@@ -7840,7 +8358,7 @@
         </w:tc>
         <w:tc>
           <w:tcPr>
-            <w:tcW w:w="2890" w:type="dxa"/>
+            <w:tcW w:w="3155" w:type="dxa"/>
             <w:tcBorders/>
             <w:vAlign w:val="center"/>
           </w:tcPr>
@@ -7860,7 +8378,7 @@
         </w:tc>
         <w:tc>
           <w:tcPr>
-            <w:tcW w:w="1218" w:type="dxa"/>
+            <w:tcW w:w="1201" w:type="dxa"/>
             <w:tcBorders/>
             <w:vAlign w:val="center"/>
           </w:tcPr>
@@ -7903,7 +8421,7 @@
         </w:tc>
         <w:tc>
           <w:tcPr>
-            <w:tcW w:w="6702" w:type="dxa"/>
+            <w:tcW w:w="6454" w:type="dxa"/>
             <w:tcBorders/>
             <w:vAlign w:val="center"/>
           </w:tcPr>
@@ -7939,7 +8457,7 @@
         </w:tc>
         <w:tc>
           <w:tcPr>
-            <w:tcW w:w="2890" w:type="dxa"/>
+            <w:tcW w:w="3155" w:type="dxa"/>
             <w:tcBorders/>
             <w:vAlign w:val="center"/>
           </w:tcPr>
@@ -7963,7 +8481,7 @@
         </w:tc>
         <w:tc>
           <w:tcPr>
-            <w:tcW w:w="1218" w:type="dxa"/>
+            <w:tcW w:w="1201" w:type="dxa"/>
             <w:tcBorders/>
             <w:vAlign w:val="center"/>
           </w:tcPr>
@@ -7983,6 +8501,1080 @@
         </w:tc>
       </w:tr>
     </w:tbl>
+    <w:p>
+      <w:pPr>
+        <w:pStyle w:val="Heading3"/>
+        <w:bidi w:val="0"/>
+        <w:jc w:val="left"/>
+        <w:rPr/>
+      </w:pPr>
+      <w:r>
+        <w:rPr/>
+        <w:t xml:space="preserve">3.1 </w:t>
+      </w:r>
+      <w:r>
+        <w:rPr/>
+        <w:t>十个阶段之外：仓库后续新增的部分</w:t>
+      </w:r>
+    </w:p>
+    <w:p>
+      <w:pPr>
+        <w:pStyle w:val="BodyText"/>
+        <w:bidi w:val="0"/>
+        <w:jc w:val="left"/>
+        <w:rPr/>
+      </w:pPr>
+      <w:r>
+        <w:rPr/>
+        <w:t xml:space="preserve">上面 </w:t>
+      </w:r>
+      <w:r>
+        <w:rPr/>
+        <w:t xml:space="preserve">10 </w:t>
+      </w:r>
+      <w:r>
+        <w:rPr/>
+        <w:t>个阶段描述的是</w:t>
+      </w:r>
+      <w:r>
+        <w:rPr>
+          <w:b/>
+        </w:rPr>
+        <w:t>基线版本</w:t>
+      </w:r>
+      <w:r>
+        <w:rPr/>
+        <w:t xml:space="preserve">（约 </w:t>
+      </w:r>
+      <w:r>
+        <w:rPr/>
+        <w:t xml:space="preserve">90 </w:t>
+      </w:r>
+      <w:r>
+        <w:rPr/>
+        <w:t xml:space="preserve">个文件）。仓库此后又迭代了交易闭环与推荐改进，所以实际是 </w:t>
+      </w:r>
+      <w:r>
+        <w:rPr/>
+        <w:t xml:space="preserve">139 </w:t>
+      </w:r>
+      <w:r>
+        <w:rPr/>
+        <w:t>个文件——差额都来自下表的增量，每一步都配一个迁移脚本，按序补即可：</w:t>
+      </w:r>
+    </w:p>
+    <w:tbl>
+      <w:tblPr>
+        <w:tblW w:w="11339" w:type="dxa"/>
+        <w:jc w:val="left"/>
+        <w:tblInd w:w="28" w:type="dxa"/>
+        <w:tblLayout w:type="fixed"/>
+        <w:tblCellMar>
+          <w:top w:w="28" w:type="dxa"/>
+          <w:left w:w="28" w:type="dxa"/>
+          <w:bottom w:w="28" w:type="dxa"/>
+          <w:right w:w="28" w:type="dxa"/>
+        </w:tblCellMar>
+      </w:tblPr>
+      <w:tblGrid>
+        <w:gridCol w:w="1650"/>
+        <w:gridCol w:w="3129"/>
+        <w:gridCol w:w="5165"/>
+        <w:gridCol w:w="1395"/>
+      </w:tblGrid>
+      <w:tr>
+        <w:trPr/>
+        <w:tc>
+          <w:tcPr>
+            <w:tcW w:w="1650" w:type="dxa"/>
+            <w:tcBorders/>
+            <w:vAlign w:val="center"/>
+          </w:tcPr>
+          <w:p>
+            <w:pPr>
+              <w:pStyle w:val="Style19"/>
+              <w:suppressLineNumbers/>
+              <w:shd w:fill="EEF1F4" w:val="clear"/>
+              <w:bidi w:val="0"/>
+              <w:spacing w:before="0" w:after="283"/>
+              <w:jc w:val="left"/>
+              <w:rPr/>
+            </w:pPr>
+            <w:r>
+              <w:rPr/>
+              <w:t>增量</w:t>
+            </w:r>
+          </w:p>
+        </w:tc>
+        <w:tc>
+          <w:tcPr>
+            <w:tcW w:w="3129" w:type="dxa"/>
+            <w:tcBorders/>
+            <w:vAlign w:val="center"/>
+          </w:tcPr>
+          <w:p>
+            <w:pPr>
+              <w:pStyle w:val="Style19"/>
+              <w:suppressLineNumbers/>
+              <w:shd w:fill="EEF1F4" w:val="clear"/>
+              <w:bidi w:val="0"/>
+              <w:spacing w:before="0" w:after="283"/>
+              <w:jc w:val="left"/>
+              <w:rPr/>
+            </w:pPr>
+            <w:r>
+              <w:rPr/>
+              <w:t>迁移脚本</w:t>
+            </w:r>
+          </w:p>
+        </w:tc>
+        <w:tc>
+          <w:tcPr>
+            <w:tcW w:w="5165" w:type="dxa"/>
+            <w:tcBorders/>
+            <w:vAlign w:val="center"/>
+          </w:tcPr>
+          <w:p>
+            <w:pPr>
+              <w:pStyle w:val="Style19"/>
+              <w:suppressLineNumbers/>
+              <w:shd w:fill="EEF1F4" w:val="clear"/>
+              <w:bidi w:val="0"/>
+              <w:spacing w:before="0" w:after="283"/>
+              <w:jc w:val="left"/>
+              <w:rPr/>
+            </w:pPr>
+            <w:r>
+              <w:rPr/>
+              <w:t>主要内容</w:t>
+            </w:r>
+          </w:p>
+        </w:tc>
+        <w:tc>
+          <w:tcPr>
+            <w:tcW w:w="1395" w:type="dxa"/>
+            <w:tcBorders/>
+            <w:vAlign w:val="center"/>
+          </w:tcPr>
+          <w:p>
+            <w:pPr>
+              <w:pStyle w:val="Style19"/>
+              <w:suppressLineNumbers/>
+              <w:shd w:fill="EEF1F4" w:val="clear"/>
+              <w:bidi w:val="0"/>
+              <w:spacing w:before="0" w:after="283"/>
+              <w:jc w:val="left"/>
+              <w:rPr/>
+            </w:pPr>
+            <w:r>
+              <w:rPr/>
+              <w:t>参考</w:t>
+            </w:r>
+          </w:p>
+        </w:tc>
+      </w:tr>
+      <w:tr>
+        <w:trPr/>
+        <w:tc>
+          <w:tcPr>
+            <w:tcW w:w="1650" w:type="dxa"/>
+            <w:tcBorders/>
+            <w:vAlign w:val="center"/>
+          </w:tcPr>
+          <w:p>
+            <w:pPr>
+              <w:pStyle w:val="Style14"/>
+              <w:bidi w:val="0"/>
+              <w:spacing w:before="0" w:after="283"/>
+              <w:jc w:val="left"/>
+              <w:rPr/>
+            </w:pPr>
+            <w:r>
+              <w:rPr/>
+              <w:t>收藏与轮播图</w:t>
+            </w:r>
+          </w:p>
+        </w:tc>
+        <w:tc>
+          <w:tcPr>
+            <w:tcW w:w="3129" w:type="dxa"/>
+            <w:tcBorders/>
+            <w:vAlign w:val="center"/>
+          </w:tcPr>
+          <w:p>
+            <w:pPr>
+              <w:pStyle w:val="Style14"/>
+              <w:bidi w:val="0"/>
+              <w:spacing w:before="0" w:after="283"/>
+              <w:jc w:val="left"/>
+              <w:rPr/>
+            </w:pPr>
+            <w:r>
+              <w:rPr/>
+              <w:t>`V2__favorite_carousel.sql`</w:t>
+            </w:r>
+          </w:p>
+        </w:tc>
+        <w:tc>
+          <w:tcPr>
+            <w:tcW w:w="5165" w:type="dxa"/>
+            <w:tcBorders/>
+            <w:vAlign w:val="center"/>
+          </w:tcPr>
+          <w:p>
+            <w:pPr>
+              <w:pStyle w:val="Style14"/>
+              <w:bidi w:val="0"/>
+              <w:spacing w:before="0" w:after="283"/>
+              <w:jc w:val="left"/>
+              <w:rPr/>
+            </w:pPr>
+            <w:r>
+              <w:rPr/>
+              <w:t>`favorite`</w:t>
+            </w:r>
+            <w:r>
+              <w:rPr/>
+              <w:t>、</w:t>
+            </w:r>
+            <w:r>
+              <w:rPr/>
+              <w:t xml:space="preserve">`carousel` </w:t>
+            </w:r>
+            <w:r>
+              <w:rPr/>
+              <w:t>表与接口</w:t>
+            </w:r>
+          </w:p>
+        </w:tc>
+        <w:tc>
+          <w:tcPr>
+            <w:tcW w:w="1395" w:type="dxa"/>
+            <w:tcBorders/>
+            <w:vAlign w:val="center"/>
+          </w:tcPr>
+          <w:p>
+            <w:pPr>
+              <w:pStyle w:val="Style14"/>
+              <w:bidi w:val="0"/>
+              <w:spacing w:before="0" w:after="283"/>
+              <w:jc w:val="left"/>
+              <w:rPr/>
+            </w:pPr>
+            <w:r>
+              <w:rPr/>
+              <w:t>04 §9</w:t>
+            </w:r>
+          </w:p>
+        </w:tc>
+      </w:tr>
+      <w:tr>
+        <w:trPr/>
+        <w:tc>
+          <w:tcPr>
+            <w:tcW w:w="1650" w:type="dxa"/>
+            <w:tcBorders/>
+            <w:vAlign w:val="center"/>
+          </w:tcPr>
+          <w:p>
+            <w:pPr>
+              <w:pStyle w:val="Style14"/>
+              <w:bidi w:val="0"/>
+              <w:spacing w:before="0" w:after="283"/>
+              <w:jc w:val="left"/>
+              <w:rPr/>
+            </w:pPr>
+            <w:r>
+              <w:rPr/>
+              <w:t>个人资料</w:t>
+            </w:r>
+          </w:p>
+        </w:tc>
+        <w:tc>
+          <w:tcPr>
+            <w:tcW w:w="3129" w:type="dxa"/>
+            <w:tcBorders/>
+            <w:vAlign w:val="center"/>
+          </w:tcPr>
+          <w:p>
+            <w:pPr>
+              <w:pStyle w:val="Style14"/>
+              <w:bidi w:val="0"/>
+              <w:spacing w:before="0" w:after="283"/>
+              <w:jc w:val="left"/>
+              <w:rPr/>
+            </w:pPr>
+            <w:r>
+              <w:rPr/>
+              <w:t>`V3__user_profile.sql`</w:t>
+            </w:r>
+          </w:p>
+        </w:tc>
+        <w:tc>
+          <w:tcPr>
+            <w:tcW w:w="5165" w:type="dxa"/>
+            <w:tcBorders/>
+            <w:vAlign w:val="center"/>
+          </w:tcPr>
+          <w:p>
+            <w:pPr>
+              <w:pStyle w:val="Style14"/>
+              <w:bidi w:val="0"/>
+              <w:spacing w:before="0" w:after="283"/>
+              <w:jc w:val="left"/>
+              <w:rPr/>
+            </w:pPr>
+            <w:r>
+              <w:rPr/>
+              <w:t xml:space="preserve">`avatar/nickname/email` </w:t>
+            </w:r>
+            <w:r>
+              <w:rPr/>
+              <w:t>字段，资料查询</w:t>
+            </w:r>
+            <w:r>
+              <w:rPr/>
+              <w:t>/</w:t>
+            </w:r>
+            <w:r>
+              <w:rPr/>
+              <w:t>修改与头像上传</w:t>
+            </w:r>
+          </w:p>
+        </w:tc>
+        <w:tc>
+          <w:tcPr>
+            <w:tcW w:w="1395" w:type="dxa"/>
+            <w:tcBorders/>
+            <w:vAlign w:val="center"/>
+          </w:tcPr>
+          <w:p>
+            <w:pPr>
+              <w:pStyle w:val="Style14"/>
+              <w:bidi w:val="0"/>
+              <w:spacing w:before="0" w:after="283"/>
+              <w:jc w:val="left"/>
+              <w:rPr/>
+            </w:pPr>
+            <w:r>
+              <w:rPr/>
+              <w:t>04 §9</w:t>
+            </w:r>
+          </w:p>
+        </w:tc>
+      </w:tr>
+      <w:tr>
+        <w:trPr/>
+        <w:tc>
+          <w:tcPr>
+            <w:tcW w:w="1650" w:type="dxa"/>
+            <w:tcBorders/>
+            <w:vAlign w:val="center"/>
+          </w:tcPr>
+          <w:p>
+            <w:pPr>
+              <w:pStyle w:val="Style14"/>
+              <w:bidi w:val="0"/>
+              <w:spacing w:before="0" w:after="283"/>
+              <w:jc w:val="left"/>
+              <w:rPr/>
+            </w:pPr>
+            <w:r>
+              <w:rPr/>
+              <w:t>收货地址</w:t>
+            </w:r>
+          </w:p>
+        </w:tc>
+        <w:tc>
+          <w:tcPr>
+            <w:tcW w:w="3129" w:type="dxa"/>
+            <w:tcBorders/>
+            <w:vAlign w:val="center"/>
+          </w:tcPr>
+          <w:p>
+            <w:pPr>
+              <w:pStyle w:val="Style14"/>
+              <w:bidi w:val="0"/>
+              <w:spacing w:before="0" w:after="283"/>
+              <w:jc w:val="left"/>
+              <w:rPr/>
+            </w:pPr>
+            <w:r>
+              <w:rPr/>
+              <w:t>`V4__user_address.sql`</w:t>
+            </w:r>
+          </w:p>
+        </w:tc>
+        <w:tc>
+          <w:tcPr>
+            <w:tcW w:w="5165" w:type="dxa"/>
+            <w:tcBorders/>
+            <w:vAlign w:val="center"/>
+          </w:tcPr>
+          <w:p>
+            <w:pPr>
+              <w:pStyle w:val="Style14"/>
+              <w:bidi w:val="0"/>
+              <w:spacing w:before="0" w:after="283"/>
+              <w:jc w:val="left"/>
+              <w:rPr/>
+            </w:pPr>
+            <w:r>
+              <w:rPr/>
+              <w:t xml:space="preserve">地址簿 </w:t>
+            </w:r>
+            <w:r>
+              <w:rPr/>
+              <w:t>CRUD</w:t>
+            </w:r>
+            <w:r>
+              <w:rPr/>
+              <w:t>，下单时引用</w:t>
+            </w:r>
+          </w:p>
+        </w:tc>
+        <w:tc>
+          <w:tcPr>
+            <w:tcW w:w="1395" w:type="dxa"/>
+            <w:tcBorders/>
+            <w:vAlign w:val="center"/>
+          </w:tcPr>
+          <w:p>
+            <w:pPr>
+              <w:pStyle w:val="Style14"/>
+              <w:bidi w:val="0"/>
+              <w:spacing w:before="0" w:after="283"/>
+              <w:jc w:val="left"/>
+              <w:rPr/>
+            </w:pPr>
+            <w:r>
+              <w:rPr/>
+              <w:t>04 §8</w:t>
+            </w:r>
+          </w:p>
+        </w:tc>
+      </w:tr>
+      <w:tr>
+        <w:trPr/>
+        <w:tc>
+          <w:tcPr>
+            <w:tcW w:w="1650" w:type="dxa"/>
+            <w:tcBorders/>
+            <w:vAlign w:val="center"/>
+          </w:tcPr>
+          <w:p>
+            <w:pPr>
+              <w:pStyle w:val="Style14"/>
+              <w:bidi w:val="0"/>
+              <w:spacing w:before="0" w:after="283"/>
+              <w:jc w:val="left"/>
+              <w:rPr/>
+            </w:pPr>
+            <w:r>
+              <w:rPr/>
+              <w:t>三级类目</w:t>
+            </w:r>
+          </w:p>
+        </w:tc>
+        <w:tc>
+          <w:tcPr>
+            <w:tcW w:w="3129" w:type="dxa"/>
+            <w:tcBorders/>
+            <w:vAlign w:val="center"/>
+          </w:tcPr>
+          <w:p>
+            <w:pPr>
+              <w:pStyle w:val="Style14"/>
+              <w:bidi w:val="0"/>
+              <w:spacing w:before="0" w:after="283"/>
+              <w:jc w:val="left"/>
+              <w:rPr/>
+            </w:pPr>
+            <w:r>
+              <w:rPr/>
+              <w:t>`V5__category_three_levels.sql`</w:t>
+            </w:r>
+          </w:p>
+        </w:tc>
+        <w:tc>
+          <w:tcPr>
+            <w:tcW w:w="5165" w:type="dxa"/>
+            <w:tcBorders/>
+            <w:vAlign w:val="center"/>
+          </w:tcPr>
+          <w:p>
+            <w:pPr>
+              <w:pStyle w:val="Style14"/>
+              <w:bidi w:val="0"/>
+              <w:spacing w:before="0" w:after="283"/>
+              <w:jc w:val="left"/>
+              <w:rPr/>
+            </w:pPr>
+            <w:r>
+              <w:rPr/>
+              <w:t>类目层级重构，商品挂三级、按后代聚合筛选</w:t>
+            </w:r>
+          </w:p>
+        </w:tc>
+        <w:tc>
+          <w:tcPr>
+            <w:tcW w:w="1395" w:type="dxa"/>
+            <w:tcBorders/>
+            <w:vAlign w:val="center"/>
+          </w:tcPr>
+          <w:p>
+            <w:pPr>
+              <w:pStyle w:val="Style14"/>
+              <w:bidi w:val="0"/>
+              <w:spacing w:before="0" w:after="283"/>
+              <w:jc w:val="left"/>
+              <w:rPr/>
+            </w:pPr>
+            <w:r>
+              <w:rPr/>
+              <w:t>05 §7</w:t>
+            </w:r>
+          </w:p>
+        </w:tc>
+      </w:tr>
+      <w:tr>
+        <w:trPr/>
+        <w:tc>
+          <w:tcPr>
+            <w:tcW w:w="1650" w:type="dxa"/>
+            <w:tcBorders/>
+            <w:vAlign w:val="center"/>
+          </w:tcPr>
+          <w:p>
+            <w:pPr>
+              <w:pStyle w:val="Style14"/>
+              <w:bidi w:val="0"/>
+              <w:spacing w:before="0" w:after="283"/>
+              <w:jc w:val="left"/>
+              <w:rPr/>
+            </w:pPr>
+            <w:r>
+              <w:rPr/>
+              <w:t>支付方式</w:t>
+            </w:r>
+          </w:p>
+        </w:tc>
+        <w:tc>
+          <w:tcPr>
+            <w:tcW w:w="3129" w:type="dxa"/>
+            <w:tcBorders/>
+            <w:vAlign w:val="center"/>
+          </w:tcPr>
+          <w:p>
+            <w:pPr>
+              <w:pStyle w:val="Style14"/>
+              <w:bidi w:val="0"/>
+              <w:spacing w:before="0" w:after="283"/>
+              <w:jc w:val="left"/>
+              <w:rPr/>
+            </w:pPr>
+            <w:r>
+              <w:rPr/>
+              <w:t>`V6__order_pay_type.sql`</w:t>
+            </w:r>
+          </w:p>
+        </w:tc>
+        <w:tc>
+          <w:tcPr>
+            <w:tcW w:w="5165" w:type="dxa"/>
+            <w:tcBorders/>
+            <w:vAlign w:val="center"/>
+          </w:tcPr>
+          <w:p>
+            <w:pPr>
+              <w:pStyle w:val="Style14"/>
+              <w:bidi w:val="0"/>
+              <w:spacing w:before="0" w:after="283"/>
+              <w:jc w:val="left"/>
+              <w:rPr/>
+            </w:pPr>
+            <w:r>
+              <w:rPr/>
+              <w:t xml:space="preserve">`pay_type` + </w:t>
+            </w:r>
+            <w:r>
+              <w:rPr/>
+              <w:t>支付接口（</w:t>
+            </w:r>
+            <w:r>
+              <w:rPr/>
+              <w:t>PENDING→PAID</w:t>
+            </w:r>
+            <w:r>
+              <w:rPr/>
+              <w:t>）</w:t>
+            </w:r>
+          </w:p>
+        </w:tc>
+        <w:tc>
+          <w:tcPr>
+            <w:tcW w:w="1395" w:type="dxa"/>
+            <w:tcBorders/>
+            <w:vAlign w:val="center"/>
+          </w:tcPr>
+          <w:p>
+            <w:pPr>
+              <w:pStyle w:val="Style14"/>
+              <w:bidi w:val="0"/>
+              <w:spacing w:before="0" w:after="283"/>
+              <w:jc w:val="left"/>
+              <w:rPr/>
+            </w:pPr>
+            <w:r>
+              <w:rPr/>
+              <w:t>04 §15.2</w:t>
+            </w:r>
+          </w:p>
+        </w:tc>
+      </w:tr>
+      <w:tr>
+        <w:trPr/>
+        <w:tc>
+          <w:tcPr>
+            <w:tcW w:w="1650" w:type="dxa"/>
+            <w:tcBorders/>
+            <w:vAlign w:val="center"/>
+          </w:tcPr>
+          <w:p>
+            <w:pPr>
+              <w:pStyle w:val="Style14"/>
+              <w:bidi w:val="0"/>
+              <w:spacing w:before="0" w:after="283"/>
+              <w:jc w:val="left"/>
+              <w:rPr/>
+            </w:pPr>
+            <w:r>
+              <w:rPr/>
+              <w:t>物流单号</w:t>
+            </w:r>
+          </w:p>
+        </w:tc>
+        <w:tc>
+          <w:tcPr>
+            <w:tcW w:w="3129" w:type="dxa"/>
+            <w:tcBorders/>
+            <w:vAlign w:val="center"/>
+          </w:tcPr>
+          <w:p>
+            <w:pPr>
+              <w:pStyle w:val="Style14"/>
+              <w:bidi w:val="0"/>
+              <w:spacing w:before="0" w:after="283"/>
+              <w:jc w:val="left"/>
+              <w:rPr/>
+            </w:pPr>
+            <w:r>
+              <w:rPr/>
+              <w:t>`V7__order_tracking_no.sql`</w:t>
+            </w:r>
+          </w:p>
+        </w:tc>
+        <w:tc>
+          <w:tcPr>
+            <w:tcW w:w="5165" w:type="dxa"/>
+            <w:tcBorders/>
+            <w:vAlign w:val="center"/>
+          </w:tcPr>
+          <w:p>
+            <w:pPr>
+              <w:pStyle w:val="Style14"/>
+              <w:bidi w:val="0"/>
+              <w:spacing w:before="0" w:after="283"/>
+              <w:jc w:val="left"/>
+              <w:rPr/>
+            </w:pPr>
+            <w:r>
+              <w:rPr/>
+              <w:t xml:space="preserve">`tracking_no` </w:t>
+            </w:r>
+            <w:r>
+              <w:rPr/>
+              <w:t>字段与发货接口</w:t>
+            </w:r>
+          </w:p>
+        </w:tc>
+        <w:tc>
+          <w:tcPr>
+            <w:tcW w:w="1395" w:type="dxa"/>
+            <w:tcBorders/>
+            <w:vAlign w:val="center"/>
+          </w:tcPr>
+          <w:p>
+            <w:pPr>
+              <w:pStyle w:val="Style14"/>
+              <w:bidi w:val="0"/>
+              <w:spacing w:before="0" w:after="283"/>
+              <w:jc w:val="left"/>
+              <w:rPr/>
+            </w:pPr>
+            <w:r>
+              <w:rPr/>
+              <w:t>04 §15.3</w:t>
+            </w:r>
+          </w:p>
+        </w:tc>
+      </w:tr>
+      <w:tr>
+        <w:trPr/>
+        <w:tc>
+          <w:tcPr>
+            <w:tcW w:w="1650" w:type="dxa"/>
+            <w:tcBorders/>
+            <w:vAlign w:val="center"/>
+          </w:tcPr>
+          <w:p>
+            <w:pPr>
+              <w:pStyle w:val="Style14"/>
+              <w:bidi w:val="0"/>
+              <w:spacing w:before="0" w:after="283"/>
+              <w:jc w:val="left"/>
+              <w:rPr/>
+            </w:pPr>
+            <w:r>
+              <w:rPr/>
+              <w:t>状态日志与通知</w:t>
+            </w:r>
+          </w:p>
+        </w:tc>
+        <w:tc>
+          <w:tcPr>
+            <w:tcW w:w="3129" w:type="dxa"/>
+            <w:tcBorders/>
+            <w:vAlign w:val="center"/>
+          </w:tcPr>
+          <w:p>
+            <w:pPr>
+              <w:pStyle w:val="Style14"/>
+              <w:bidi w:val="0"/>
+              <w:spacing w:before="0" w:after="283"/>
+              <w:jc w:val="left"/>
+              <w:rPr/>
+            </w:pPr>
+            <w:r>
+              <w:rPr/>
+              <w:t>`V8__order_log_notification.sql`</w:t>
+            </w:r>
+          </w:p>
+        </w:tc>
+        <w:tc>
+          <w:tcPr>
+            <w:tcW w:w="5165" w:type="dxa"/>
+            <w:tcBorders/>
+            <w:vAlign w:val="center"/>
+          </w:tcPr>
+          <w:p>
+            <w:pPr>
+              <w:pStyle w:val="Style14"/>
+              <w:bidi w:val="0"/>
+              <w:spacing w:before="0" w:after="283"/>
+              <w:jc w:val="left"/>
+              <w:rPr/>
+            </w:pPr>
+            <w:r>
+              <w:rPr/>
+              <w:t>`order_status_log`</w:t>
+            </w:r>
+            <w:r>
+              <w:rPr/>
+              <w:t>、</w:t>
+            </w:r>
+            <w:r>
+              <w:rPr/>
+              <w:t xml:space="preserve">`notification` </w:t>
+            </w:r>
+            <w:r>
+              <w:rPr/>
+              <w:t>两张表</w:t>
+            </w:r>
+          </w:p>
+        </w:tc>
+        <w:tc>
+          <w:tcPr>
+            <w:tcW w:w="1395" w:type="dxa"/>
+            <w:tcBorders/>
+            <w:vAlign w:val="center"/>
+          </w:tcPr>
+          <w:p>
+            <w:pPr>
+              <w:pStyle w:val="Style14"/>
+              <w:bidi w:val="0"/>
+              <w:spacing w:before="0" w:after="283"/>
+              <w:jc w:val="left"/>
+              <w:rPr/>
+            </w:pPr>
+            <w:r>
+              <w:rPr/>
+              <w:t>04 §15.6/15.7</w:t>
+            </w:r>
+          </w:p>
+        </w:tc>
+      </w:tr>
+      <w:tr>
+        <w:trPr/>
+        <w:tc>
+          <w:tcPr>
+            <w:tcW w:w="1650" w:type="dxa"/>
+            <w:tcBorders/>
+            <w:vAlign w:val="center"/>
+          </w:tcPr>
+          <w:p>
+            <w:pPr>
+              <w:pStyle w:val="Style14"/>
+              <w:bidi w:val="0"/>
+              <w:spacing w:before="0" w:after="283"/>
+              <w:jc w:val="left"/>
+              <w:rPr/>
+            </w:pPr>
+            <w:r>
+              <w:rPr/>
+              <w:t>发货时间与配送方</w:t>
+            </w:r>
+          </w:p>
+        </w:tc>
+        <w:tc>
+          <w:tcPr>
+            <w:tcW w:w="3129" w:type="dxa"/>
+            <w:tcBorders/>
+            <w:vAlign w:val="center"/>
+          </w:tcPr>
+          <w:p>
+            <w:pPr>
+              <w:pStyle w:val="Style14"/>
+              <w:bidi w:val="0"/>
+              <w:spacing w:before="0" w:after="283"/>
+              <w:jc w:val="left"/>
+              <w:rPr/>
+            </w:pPr>
+            <w:r>
+              <w:rPr/>
+              <w:t>`V9__order_ship_info.sql`</w:t>
+            </w:r>
+          </w:p>
+        </w:tc>
+        <w:tc>
+          <w:tcPr>
+            <w:tcW w:w="5165" w:type="dxa"/>
+            <w:tcBorders/>
+            <w:vAlign w:val="center"/>
+          </w:tcPr>
+          <w:p>
+            <w:pPr>
+              <w:pStyle w:val="Style14"/>
+              <w:bidi w:val="0"/>
+              <w:spacing w:before="0" w:after="283"/>
+              <w:jc w:val="left"/>
+              <w:rPr/>
+            </w:pPr>
+            <w:r>
+              <w:rPr/>
+              <w:t>`carrier`</w:t>
+            </w:r>
+            <w:r>
+              <w:rPr/>
+              <w:t>、</w:t>
+            </w:r>
+            <w:r>
+              <w:rPr/>
+              <w:t>`ship_time`</w:t>
+            </w:r>
+            <w:r>
+              <w:rPr/>
+              <w:t xml:space="preserve">，支撑 </w:t>
+            </w:r>
+            <w:r>
+              <w:rPr/>
+              <w:t xml:space="preserve">7 </w:t>
+            </w:r>
+            <w:r>
+              <w:rPr/>
+              <w:t>天自动确认收货</w:t>
+            </w:r>
+          </w:p>
+        </w:tc>
+        <w:tc>
+          <w:tcPr>
+            <w:tcW w:w="1395" w:type="dxa"/>
+            <w:tcBorders/>
+            <w:vAlign w:val="center"/>
+          </w:tcPr>
+          <w:p>
+            <w:pPr>
+              <w:pStyle w:val="Style14"/>
+              <w:bidi w:val="0"/>
+              <w:spacing w:before="0" w:after="283"/>
+              <w:jc w:val="left"/>
+              <w:rPr/>
+            </w:pPr>
+            <w:r>
+              <w:rPr/>
+              <w:t>04 §15.3/15.4</w:t>
+            </w:r>
+          </w:p>
+        </w:tc>
+      </w:tr>
+      <w:tr>
+        <w:trPr/>
+        <w:tc>
+          <w:tcPr>
+            <w:tcW w:w="1650" w:type="dxa"/>
+            <w:tcBorders/>
+            <w:vAlign w:val="center"/>
+          </w:tcPr>
+          <w:p>
+            <w:pPr>
+              <w:pStyle w:val="Style14"/>
+              <w:bidi w:val="0"/>
+              <w:spacing w:before="0" w:after="283"/>
+              <w:jc w:val="left"/>
+              <w:rPr/>
+            </w:pPr>
+            <w:r>
+              <w:rPr/>
+              <w:t>批量演示数据</w:t>
+            </w:r>
+          </w:p>
+        </w:tc>
+        <w:tc>
+          <w:tcPr>
+            <w:tcW w:w="3129" w:type="dxa"/>
+            <w:tcBorders/>
+            <w:vAlign w:val="center"/>
+          </w:tcPr>
+          <w:p>
+            <w:pPr>
+              <w:pStyle w:val="Style14"/>
+              <w:bidi w:val="0"/>
+              <w:spacing w:before="0" w:after="283"/>
+              <w:jc w:val="left"/>
+              <w:rPr/>
+            </w:pPr>
+            <w:r>
+              <w:rPr/>
+              <w:t>`V10__bulk_demo_data.sql`</w:t>
+            </w:r>
+          </w:p>
+        </w:tc>
+        <w:tc>
+          <w:tcPr>
+            <w:tcW w:w="5165" w:type="dxa"/>
+            <w:tcBorders/>
+            <w:vAlign w:val="center"/>
+          </w:tcPr>
+          <w:p>
+            <w:pPr>
+              <w:pStyle w:val="Style14"/>
+              <w:bidi w:val="0"/>
+              <w:spacing w:before="0" w:after="283"/>
+              <w:jc w:val="left"/>
+              <w:rPr/>
+            </w:pPr>
+            <w:r>
+              <w:rPr/>
+              <w:t xml:space="preserve">5000 </w:t>
+            </w:r>
+            <w:r>
+              <w:rPr/>
+              <w:t xml:space="preserve">商品 </w:t>
+            </w:r>
+            <w:r>
+              <w:rPr/>
+              <w:t xml:space="preserve">/ 701 </w:t>
+            </w:r>
+            <w:r>
+              <w:rPr/>
+              <w:t xml:space="preserve">用户 </w:t>
+            </w:r>
+            <w:r>
+              <w:rPr/>
+              <w:t xml:space="preserve">/ 2.5 </w:t>
+            </w:r>
+            <w:r>
+              <w:rPr/>
+              <w:t>万行为（可选）</w:t>
+            </w:r>
+          </w:p>
+        </w:tc>
+        <w:tc>
+          <w:tcPr>
+            <w:tcW w:w="1395" w:type="dxa"/>
+            <w:tcBorders/>
+            <w:vAlign w:val="center"/>
+          </w:tcPr>
+          <w:p>
+            <w:pPr>
+              <w:pStyle w:val="Style14"/>
+              <w:bidi w:val="0"/>
+              <w:spacing w:before="0" w:after="283"/>
+              <w:jc w:val="left"/>
+              <w:rPr/>
+            </w:pPr>
+            <w:r>
+              <w:rPr/>
+              <w:t>05 §7.3</w:t>
+            </w:r>
+          </w:p>
+        </w:tc>
+      </w:tr>
+    </w:tbl>
+    <w:p>
+      <w:pPr>
+        <w:pStyle w:val="Style18"/>
+        <w:bidi w:val="0"/>
+        <w:jc w:val="left"/>
+        <w:rPr/>
+      </w:pPr>
+      <w:r>
+        <w:rPr/>
+        <w:t>推荐侧的模型缓存、多样性打散、冷启动三项</w:t>
+      </w:r>
+      <w:r>
+        <w:rPr>
+          <w:b/>
+        </w:rPr>
+        <w:t>不涉及表结构</w:t>
+      </w:r>
+      <w:r>
+        <w:rPr/>
+        <w:t xml:space="preserve">，改的是 </w:t>
+      </w:r>
+      <w:r>
+        <w:rPr/>
+        <w:t xml:space="preserve">`recommend` </w:t>
+      </w:r>
+      <w:r>
+        <w:rPr/>
+        <w:t xml:space="preserve">包与 </w:t>
+      </w:r>
+      <w:r>
+        <w:rPr/>
+        <w:t>`RecommendServiceImpl`</w:t>
+      </w:r>
+      <w:r>
+        <w:rPr/>
+        <w:t xml:space="preserve">，详见详细设计 </w:t>
+      </w:r>
+      <w:r>
+        <w:rPr/>
+        <w:t>15.8~15.10</w:t>
+      </w:r>
+      <w:r>
+        <w:rPr/>
+        <w:t xml:space="preserve">。这三项建议在 </w:t>
+      </w:r>
+      <w:r>
+        <w:rPr/>
+        <w:t xml:space="preserve">10 </w:t>
+      </w:r>
+      <w:r>
+        <w:rPr/>
+        <w:t>个阶段全部跑通之后再补——它们是对已有算法的优化，脱离基线不好理解。</w:t>
+      </w:r>
+    </w:p>
     <w:p>
       <w:pPr>
         <w:pStyle w:val="BodyText"/>
@@ -9268,7 +10860,15 @@
       </w:r>
       <w:r>
         <w:rPr/>
-        <w:t>对照。</w:t>
+        <w:t xml:space="preserve">对照基线答案，想看含交易闭环与推荐改进的最终形态用 </w:t>
+      </w:r>
+      <w:r>
+        <w:rPr/>
+        <w:t>`template-v2`</w:t>
+      </w:r>
+      <w:r>
+        <w:rPr/>
+        <w:t>。</w:t>
       </w:r>
     </w:p>
     <w:p>

</xml_diff>